<commit_message>
Actualiza pantalla inicial y versión final del entregable
</commit_message>
<xml_diff>
--- a/01_docs/06_Entregables/ACA_1_Grupo_E_Jhoan_Andres_castelblanco_Julian_Eliecer_Orellanos_2.docx
+++ b/01_docs/06_Entregables/ACA_1_Grupo_E_Jhoan_Andres_castelblanco_Julian_Eliecer_Orellanos_2.docx
@@ -103,41 +103,20 @@
         <w:rPr>
           <w:bCs/>
         </w:rPr>
-        <w:t xml:space="preserve">ACA 1: </w:t>
+        <w:t xml:space="preserve">ACA 1: Diseñar la arquitectura orientada a objetos de un </w:t>
+      </w:r>
+      <w:r>
+        <w:rPr>
+          <w:bCs/>
+          <w:u w:val="single"/>
+        </w:rPr>
+        <w:t>videojuego</w:t>
       </w:r>
       <w:r>
         <w:rPr>
           <w:bCs/>
         </w:rPr>
-        <w:t xml:space="preserve">Diseñar la arquitectura orientada a objetos de un videojuego tipo </w:t>
-      </w:r>
-      <w:proofErr w:type="spellStart"/>
-      <w:r>
-        <w:rPr>
-          <w:bCs/>
-        </w:rPr>
-        <w:t>Breakout</w:t>
-      </w:r>
-      <w:proofErr w:type="spellEnd"/>
-      <w:r>
-        <w:rPr>
-          <w:bCs/>
-        </w:rPr>
-        <w:t xml:space="preserve"> en </w:t>
-      </w:r>
-      <w:proofErr w:type="spellStart"/>
-      <w:r>
-        <w:rPr>
-          <w:bCs/>
-        </w:rPr>
-        <w:t>Lua</w:t>
-      </w:r>
-      <w:proofErr w:type="spellEnd"/>
-      <w:r>
-        <w:rPr>
-          <w:bCs/>
-        </w:rPr>
-        <w:t>, modelando entidades, responsabilidades y máquinas de estado en formato UML y pseudocódigo</w:t>
+        <w:t xml:space="preserve"> tipo Breakout en Lua, modelando entidades, responsabilidades y máquinas de estado en formato UML y pseudocódigo</w:t>
       </w:r>
     </w:p>
     <w:p>
@@ -191,18 +170,8 @@
         <w:jc w:val="center"/>
       </w:pPr>
       <w:r>
-        <w:t xml:space="preserve">Julian Eleicer </w:t>
-      </w:r>
-      <w:proofErr w:type="spellStart"/>
-      <w:r>
-        <w:t>Orellanos</w:t>
-      </w:r>
-      <w:proofErr w:type="spellEnd"/>
-    </w:p>
-    <w:p>
-      <w:pPr>
-        <w:jc w:val="center"/>
-      </w:pPr>
+        <w:t>Julian Eleicer Orellanos</w:t>
+      </w:r>
     </w:p>
     <w:p>
       <w:pPr>
@@ -220,9 +189,6 @@
           <w:tab w:val="left" w:pos="3495"/>
         </w:tabs>
       </w:pPr>
-      <w:r>
-        <w:tab/>
-      </w:r>
     </w:p>
     <w:p>
       <w:pPr>
@@ -258,11 +224,40 @@
       </w:r>
     </w:p>
     <w:p>
-      <w:r>
-        <w:lastRenderedPageBreak/>
+      <w:pPr>
+        <w:jc w:val="center"/>
+      </w:pPr>
+      <w:r>
+        <w:t>Repositorio</w:t>
+      </w:r>
+      <w:r>
         <w:t xml:space="preserve"> </w:t>
       </w:r>
-    </w:p>
+      <w:r>
+        <w:t xml:space="preserve">Github: </w:t>
+      </w:r>
+      <w:hyperlink r:id="rId9" w:history="1">
+        <w:r>
+          <w:rPr>
+            <w:rStyle w:val="Hipervnculo"/>
+          </w:rPr>
+          <w:t>https://github.com/johancastel/Breakout-Guardian</w:t>
+        </w:r>
+        <w:r>
+          <w:rPr>
+            <w:rStyle w:val="Hipervnculo"/>
+          </w:rPr>
+          <w:t>s</w:t>
+        </w:r>
+        <w:r>
+          <w:rPr>
+            <w:rStyle w:val="Hipervnculo"/>
+          </w:rPr>
+          <w:t>-of-the-Forge</w:t>
+        </w:r>
+      </w:hyperlink>
+    </w:p>
+    <w:p/>
     <w:p>
       <w:pPr>
         <w:pStyle w:val="Prrafodelista"/>
@@ -272,15 +267,7 @@
         </w:numPr>
       </w:pPr>
       <w:r>
-        <w:t xml:space="preserve">Diagrama UML de clases del </w:t>
-      </w:r>
-      <w:proofErr w:type="spellStart"/>
-      <w:r>
-        <w:t>Breakout</w:t>
-      </w:r>
-      <w:proofErr w:type="spellEnd"/>
-      <w:r>
-        <w:t>.</w:t>
+        <w:t>Diagrama UML de clases del Breakout.</w:t>
       </w:r>
     </w:p>
     <w:p/>
@@ -309,7 +296,7 @@
                     </pic:cNvPicPr>
                   </pic:nvPicPr>
                   <pic:blipFill>
-                    <a:blip r:embed="rId9">
+                    <a:blip r:embed="rId10">
                       <a:extLst>
                         <a:ext uri="{28A0092B-C50C-407E-A947-70E740481C1C}">
                           <a14:useLocalDpi xmlns:a14="http://schemas.microsoft.com/office/drawing/2010/main" val="0"/>
@@ -385,7 +372,7 @@
                     </pic:cNvPicPr>
                   </pic:nvPicPr>
                   <pic:blipFill>
-                    <a:blip r:embed="rId10">
+                    <a:blip r:embed="rId11">
                       <a:extLst>
                         <a:ext uri="{28A0092B-C50C-407E-A947-70E740481C1C}">
                           <a14:useLocalDpi xmlns:a14="http://schemas.microsoft.com/office/drawing/2010/main" val="0"/>
@@ -495,33 +482,7 @@
                 <w:szCs w:val="22"/>
                 <w:lang w:val="en-US"/>
               </w:rPr>
-              <w:t xml:space="preserve">table of </w:t>
-            </w:r>
-            <w:proofErr w:type="spellStart"/>
-            <w:r>
-              <w:rPr>
-                <w:rFonts w:ascii="Aptos Narrow" w:hAnsi="Aptos Narrow"/>
-                <w:b/>
-                <w:bCs/>
-                <w:color w:val="000000"/>
-                <w:sz w:val="22"/>
-                <w:szCs w:val="22"/>
-                <w:lang w:val="en-US"/>
-              </w:rPr>
-              <w:t>responsable</w:t>
-            </w:r>
-            <w:proofErr w:type="spellEnd"/>
-            <w:r>
-              <w:rPr>
-                <w:rFonts w:ascii="Aptos Narrow" w:hAnsi="Aptos Narrow"/>
-                <w:b/>
-                <w:bCs/>
-                <w:color w:val="000000"/>
-                <w:sz w:val="22"/>
-                <w:szCs w:val="22"/>
-                <w:lang w:val="en-US"/>
-              </w:rPr>
-              <w:t xml:space="preserve"> part - Breakout: Guardians of the Forge</w:t>
+              <w:t>table of responsable part - Breakout: Guardians of the Forge</w:t>
             </w:r>
           </w:p>
         </w:tc>
@@ -748,7 +709,6 @@
                 <w:szCs w:val="22"/>
               </w:rPr>
             </w:pPr>
-            <w:proofErr w:type="spellStart"/>
             <w:r>
               <w:rPr>
                 <w:rFonts w:ascii="Aptos Narrow" w:hAnsi="Aptos Narrow"/>
@@ -758,7 +718,6 @@
               </w:rPr>
               <w:t>Game</w:t>
             </w:r>
-            <w:proofErr w:type="spellEnd"/>
           </w:p>
         </w:tc>
         <w:tc>
@@ -818,7 +777,6 @@
                 <w:szCs w:val="22"/>
               </w:rPr>
             </w:pPr>
-            <w:proofErr w:type="spellStart"/>
             <w:r>
               <w:rPr>
                 <w:rFonts w:ascii="Aptos Narrow" w:hAnsi="Aptos Narrow"/>
@@ -826,29 +784,8 @@
                 <w:sz w:val="22"/>
                 <w:szCs w:val="22"/>
               </w:rPr>
-              <w:t>currentState</w:t>
+              <w:t>currentState, score, lives</w:t>
             </w:r>
-            <w:proofErr w:type="spellEnd"/>
-            <w:r>
-              <w:rPr>
-                <w:rFonts w:ascii="Aptos Narrow" w:hAnsi="Aptos Narrow"/>
-                <w:color w:val="000000"/>
-                <w:sz w:val="22"/>
-                <w:szCs w:val="22"/>
-              </w:rPr>
-              <w:t xml:space="preserve">, score, </w:t>
-            </w:r>
-            <w:proofErr w:type="spellStart"/>
-            <w:r>
-              <w:rPr>
-                <w:rFonts w:ascii="Aptos Narrow" w:hAnsi="Aptos Narrow"/>
-                <w:color w:val="000000"/>
-                <w:sz w:val="22"/>
-                <w:szCs w:val="22"/>
-              </w:rPr>
-              <w:t>lives</w:t>
-            </w:r>
-            <w:proofErr w:type="spellEnd"/>
           </w:p>
         </w:tc>
         <w:tc>
@@ -874,7 +811,6 @@
                 <w:szCs w:val="22"/>
               </w:rPr>
             </w:pPr>
-            <w:proofErr w:type="gramStart"/>
             <w:r>
               <w:rPr>
                 <w:rFonts w:ascii="Aptos Narrow" w:hAnsi="Aptos Narrow"/>
@@ -882,110 +818,7 @@
                 <w:sz w:val="22"/>
                 <w:szCs w:val="22"/>
               </w:rPr>
-              <w:t>load(</w:t>
-            </w:r>
-            <w:proofErr w:type="gramEnd"/>
-            <w:r>
-              <w:rPr>
-                <w:rFonts w:ascii="Aptos Narrow" w:hAnsi="Aptos Narrow"/>
-                <w:color w:val="000000"/>
-                <w:sz w:val="22"/>
-                <w:szCs w:val="22"/>
-              </w:rPr>
-              <w:t xml:space="preserve">), </w:t>
-            </w:r>
-            <w:proofErr w:type="spellStart"/>
-            <w:proofErr w:type="gramStart"/>
-            <w:r>
-              <w:rPr>
-                <w:rFonts w:ascii="Aptos Narrow" w:hAnsi="Aptos Narrow"/>
-                <w:color w:val="000000"/>
-                <w:sz w:val="22"/>
-                <w:szCs w:val="22"/>
-              </w:rPr>
-              <w:t>update</w:t>
-            </w:r>
-            <w:proofErr w:type="spellEnd"/>
-            <w:r>
-              <w:rPr>
-                <w:rFonts w:ascii="Aptos Narrow" w:hAnsi="Aptos Narrow"/>
-                <w:color w:val="000000"/>
-                <w:sz w:val="22"/>
-                <w:szCs w:val="22"/>
-              </w:rPr>
-              <w:t>(</w:t>
-            </w:r>
-            <w:proofErr w:type="gramEnd"/>
-            <w:r>
-              <w:rPr>
-                <w:rFonts w:ascii="Aptos Narrow" w:hAnsi="Aptos Narrow"/>
-                <w:color w:val="000000"/>
-                <w:sz w:val="22"/>
-                <w:szCs w:val="22"/>
-              </w:rPr>
-              <w:t xml:space="preserve">), </w:t>
-            </w:r>
-            <w:proofErr w:type="spellStart"/>
-            <w:proofErr w:type="gramStart"/>
-            <w:r>
-              <w:rPr>
-                <w:rFonts w:ascii="Aptos Narrow" w:hAnsi="Aptos Narrow"/>
-                <w:color w:val="000000"/>
-                <w:sz w:val="22"/>
-                <w:szCs w:val="22"/>
-              </w:rPr>
-              <w:t>draw</w:t>
-            </w:r>
-            <w:proofErr w:type="spellEnd"/>
-            <w:r>
-              <w:rPr>
-                <w:rFonts w:ascii="Aptos Narrow" w:hAnsi="Aptos Narrow"/>
-                <w:color w:val="000000"/>
-                <w:sz w:val="22"/>
-                <w:szCs w:val="22"/>
-              </w:rPr>
-              <w:t>(</w:t>
-            </w:r>
-            <w:proofErr w:type="gramEnd"/>
-            <w:r>
-              <w:rPr>
-                <w:rFonts w:ascii="Aptos Narrow" w:hAnsi="Aptos Narrow"/>
-                <w:color w:val="000000"/>
-                <w:sz w:val="22"/>
-                <w:szCs w:val="22"/>
-              </w:rPr>
-              <w:t xml:space="preserve">), </w:t>
-            </w:r>
-            <w:proofErr w:type="spellStart"/>
-            <w:proofErr w:type="gramStart"/>
-            <w:r>
-              <w:rPr>
-                <w:rFonts w:ascii="Aptos Narrow" w:hAnsi="Aptos Narrow"/>
-                <w:color w:val="000000"/>
-                <w:sz w:val="22"/>
-                <w:szCs w:val="22"/>
-              </w:rPr>
-              <w:t>restartGame</w:t>
-            </w:r>
-            <w:proofErr w:type="spellEnd"/>
-            <w:r>
-              <w:rPr>
-                <w:rFonts w:ascii="Aptos Narrow" w:hAnsi="Aptos Narrow"/>
-                <w:color w:val="000000"/>
-                <w:sz w:val="22"/>
-                <w:szCs w:val="22"/>
-              </w:rPr>
-              <w:t>(</w:t>
-            </w:r>
-            <w:proofErr w:type="gramEnd"/>
-            <w:r>
-              <w:rPr>
-                <w:rFonts w:ascii="Aptos Narrow" w:hAnsi="Aptos Narrow"/>
-                <w:color w:val="000000"/>
-                <w:sz w:val="22"/>
-                <w:szCs w:val="22"/>
-              </w:rPr>
-              <w:t>)</w:t>
+              <w:t>load(), update(), draw(), restartGame()</w:t>
             </w:r>
           </w:p>
         </w:tc>
@@ -1128,42 +961,8 @@
                 <w:szCs w:val="22"/>
                 <w:lang w:val="en-US"/>
               </w:rPr>
-              <w:t xml:space="preserve">x, y, radius, </w:t>
+              <w:t>x, y, radius, speedX, speedY</w:t>
             </w:r>
-            <w:proofErr w:type="spellStart"/>
-            <w:r>
-              <w:rPr>
-                <w:rFonts w:ascii="Aptos Narrow" w:hAnsi="Aptos Narrow"/>
-                <w:color w:val="000000"/>
-                <w:sz w:val="22"/>
-                <w:szCs w:val="22"/>
-                <w:lang w:val="en-US"/>
-              </w:rPr>
-              <w:t>speedX</w:t>
-            </w:r>
-            <w:proofErr w:type="spellEnd"/>
-            <w:r>
-              <w:rPr>
-                <w:rFonts w:ascii="Aptos Narrow" w:hAnsi="Aptos Narrow"/>
-                <w:color w:val="000000"/>
-                <w:sz w:val="22"/>
-                <w:szCs w:val="22"/>
-                <w:lang w:val="en-US"/>
-              </w:rPr>
-              <w:t xml:space="preserve">, </w:t>
-            </w:r>
-            <w:proofErr w:type="spellStart"/>
-            <w:r>
-              <w:rPr>
-                <w:rFonts w:ascii="Aptos Narrow" w:hAnsi="Aptos Narrow"/>
-                <w:color w:val="000000"/>
-                <w:sz w:val="22"/>
-                <w:szCs w:val="22"/>
-                <w:lang w:val="en-US"/>
-              </w:rPr>
-              <w:t>speedY</w:t>
-            </w:r>
-            <w:proofErr w:type="spellEnd"/>
           </w:p>
         </w:tc>
         <w:tc>
@@ -1189,8 +988,6 @@
                 <w:szCs w:val="22"/>
               </w:rPr>
             </w:pPr>
-            <w:proofErr w:type="spellStart"/>
-            <w:proofErr w:type="gramStart"/>
             <w:r>
               <w:rPr>
                 <w:rFonts w:ascii="Aptos Narrow" w:hAnsi="Aptos Narrow"/>
@@ -1198,89 +995,7 @@
                 <w:sz w:val="22"/>
                 <w:szCs w:val="22"/>
               </w:rPr>
-              <w:t>move</w:t>
-            </w:r>
-            <w:proofErr w:type="spellEnd"/>
-            <w:r>
-              <w:rPr>
-                <w:rFonts w:ascii="Aptos Narrow" w:hAnsi="Aptos Narrow"/>
-                <w:color w:val="000000"/>
-                <w:sz w:val="22"/>
-                <w:szCs w:val="22"/>
-              </w:rPr>
-              <w:t>(</w:t>
-            </w:r>
-            <w:proofErr w:type="gramEnd"/>
-            <w:r>
-              <w:rPr>
-                <w:rFonts w:ascii="Aptos Narrow" w:hAnsi="Aptos Narrow"/>
-                <w:color w:val="000000"/>
-                <w:sz w:val="22"/>
-                <w:szCs w:val="22"/>
-              </w:rPr>
-              <w:t xml:space="preserve">), </w:t>
-            </w:r>
-            <w:proofErr w:type="spellStart"/>
-            <w:proofErr w:type="gramStart"/>
-            <w:r>
-              <w:rPr>
-                <w:rFonts w:ascii="Aptos Narrow" w:hAnsi="Aptos Narrow"/>
-                <w:color w:val="000000"/>
-                <w:sz w:val="22"/>
-                <w:szCs w:val="22"/>
-              </w:rPr>
-              <w:t>bounce</w:t>
-            </w:r>
-            <w:proofErr w:type="spellEnd"/>
-            <w:r>
-              <w:rPr>
-                <w:rFonts w:ascii="Aptos Narrow" w:hAnsi="Aptos Narrow"/>
-                <w:color w:val="000000"/>
-                <w:sz w:val="22"/>
-                <w:szCs w:val="22"/>
-              </w:rPr>
-              <w:t>(</w:t>
-            </w:r>
-            <w:proofErr w:type="gramEnd"/>
-            <w:r>
-              <w:rPr>
-                <w:rFonts w:ascii="Aptos Narrow" w:hAnsi="Aptos Narrow"/>
-                <w:color w:val="000000"/>
-                <w:sz w:val="22"/>
-                <w:szCs w:val="22"/>
-              </w:rPr>
-              <w:t xml:space="preserve">), </w:t>
-            </w:r>
-            <w:proofErr w:type="spellStart"/>
-            <w:proofErr w:type="gramStart"/>
-            <w:r>
-              <w:rPr>
-                <w:rFonts w:ascii="Aptos Narrow" w:hAnsi="Aptos Narrow"/>
-                <w:color w:val="000000"/>
-                <w:sz w:val="22"/>
-                <w:szCs w:val="22"/>
-              </w:rPr>
-              <w:t>draw</w:t>
-            </w:r>
-            <w:proofErr w:type="spellEnd"/>
-            <w:r>
-              <w:rPr>
-                <w:rFonts w:ascii="Aptos Narrow" w:hAnsi="Aptos Narrow"/>
-                <w:color w:val="000000"/>
-                <w:sz w:val="22"/>
-                <w:szCs w:val="22"/>
-              </w:rPr>
-              <w:t>(</w:t>
-            </w:r>
-            <w:proofErr w:type="gramEnd"/>
-            <w:r>
-              <w:rPr>
-                <w:rFonts w:ascii="Aptos Narrow" w:hAnsi="Aptos Narrow"/>
-                <w:color w:val="000000"/>
-                <w:sz w:val="22"/>
-                <w:szCs w:val="22"/>
-              </w:rPr>
-              <w:t>)</w:t>
+              <w:t>move(), bounce(), draw()</w:t>
             </w:r>
           </w:p>
         </w:tc>
@@ -1307,7 +1022,6 @@
                 <w:szCs w:val="22"/>
               </w:rPr>
             </w:pPr>
-            <w:proofErr w:type="gramStart"/>
             <w:r>
               <w:rPr>
                 <w:rFonts w:ascii="Aptos Narrow" w:hAnsi="Aptos Narrow"/>
@@ -1315,29 +1029,8 @@
                 <w:sz w:val="22"/>
                 <w:szCs w:val="22"/>
               </w:rPr>
-              <w:t>Paddle</w:t>
+              <w:t>Paddle, Brick, PowerUp</w:t>
             </w:r>
-            <w:proofErr w:type="gramEnd"/>
-            <w:r>
-              <w:rPr>
-                <w:rFonts w:ascii="Aptos Narrow" w:hAnsi="Aptos Narrow"/>
-                <w:color w:val="000000"/>
-                <w:sz w:val="22"/>
-                <w:szCs w:val="22"/>
-              </w:rPr>
-              <w:t xml:space="preserve">, Brick, </w:t>
-            </w:r>
-            <w:proofErr w:type="spellStart"/>
-            <w:r>
-              <w:rPr>
-                <w:rFonts w:ascii="Aptos Narrow" w:hAnsi="Aptos Narrow"/>
-                <w:color w:val="000000"/>
-                <w:sz w:val="22"/>
-                <w:szCs w:val="22"/>
-              </w:rPr>
-              <w:t>PowerUp</w:t>
-            </w:r>
-            <w:proofErr w:type="spellEnd"/>
           </w:p>
         </w:tc>
       </w:tr>
@@ -1368,7 +1061,6 @@
                 <w:szCs w:val="22"/>
               </w:rPr>
             </w:pPr>
-            <w:proofErr w:type="gramStart"/>
             <w:r>
               <w:rPr>
                 <w:rFonts w:ascii="Aptos Narrow" w:hAnsi="Aptos Narrow"/>
@@ -1378,7 +1070,6 @@
               </w:rPr>
               <w:t>Paddle</w:t>
             </w:r>
-            <w:proofErr w:type="gramEnd"/>
           </w:p>
         </w:tc>
         <w:tc>
@@ -1445,39 +1136,8 @@
                 <w:sz w:val="22"/>
                 <w:szCs w:val="22"/>
               </w:rPr>
-              <w:t xml:space="preserve">x, y, </w:t>
+              <w:t>x, y, width, speed</w:t>
             </w:r>
-            <w:proofErr w:type="spellStart"/>
-            <w:r>
-              <w:rPr>
-                <w:rFonts w:ascii="Aptos Narrow" w:hAnsi="Aptos Narrow"/>
-                <w:color w:val="000000"/>
-                <w:sz w:val="22"/>
-                <w:szCs w:val="22"/>
-              </w:rPr>
-              <w:t>width</w:t>
-            </w:r>
-            <w:proofErr w:type="spellEnd"/>
-            <w:r>
-              <w:rPr>
-                <w:rFonts w:ascii="Aptos Narrow" w:hAnsi="Aptos Narrow"/>
-                <w:color w:val="000000"/>
-                <w:sz w:val="22"/>
-                <w:szCs w:val="22"/>
-              </w:rPr>
-              <w:t xml:space="preserve">, </w:t>
-            </w:r>
-            <w:proofErr w:type="spellStart"/>
-            <w:r>
-              <w:rPr>
-                <w:rFonts w:ascii="Aptos Narrow" w:hAnsi="Aptos Narrow"/>
-                <w:color w:val="000000"/>
-                <w:sz w:val="22"/>
-                <w:szCs w:val="22"/>
-              </w:rPr>
-              <w:t>speed</w:t>
-            </w:r>
-            <w:proofErr w:type="spellEnd"/>
           </w:p>
         </w:tc>
         <w:tc>
@@ -1503,8 +1163,6 @@
                 <w:szCs w:val="22"/>
               </w:rPr>
             </w:pPr>
-            <w:proofErr w:type="spellStart"/>
-            <w:proofErr w:type="gramStart"/>
             <w:r>
               <w:rPr>
                 <w:rFonts w:ascii="Aptos Narrow" w:hAnsi="Aptos Narrow"/>
@@ -1512,89 +1170,7 @@
                 <w:sz w:val="22"/>
                 <w:szCs w:val="22"/>
               </w:rPr>
-              <w:t>moveLeft</w:t>
-            </w:r>
-            <w:proofErr w:type="spellEnd"/>
-            <w:r>
-              <w:rPr>
-                <w:rFonts w:ascii="Aptos Narrow" w:hAnsi="Aptos Narrow"/>
-                <w:color w:val="000000"/>
-                <w:sz w:val="22"/>
-                <w:szCs w:val="22"/>
-              </w:rPr>
-              <w:t>(</w:t>
-            </w:r>
-            <w:proofErr w:type="gramEnd"/>
-            <w:r>
-              <w:rPr>
-                <w:rFonts w:ascii="Aptos Narrow" w:hAnsi="Aptos Narrow"/>
-                <w:color w:val="000000"/>
-                <w:sz w:val="22"/>
-                <w:szCs w:val="22"/>
-              </w:rPr>
-              <w:t xml:space="preserve">), </w:t>
-            </w:r>
-            <w:proofErr w:type="spellStart"/>
-            <w:proofErr w:type="gramStart"/>
-            <w:r>
-              <w:rPr>
-                <w:rFonts w:ascii="Aptos Narrow" w:hAnsi="Aptos Narrow"/>
-                <w:color w:val="000000"/>
-                <w:sz w:val="22"/>
-                <w:szCs w:val="22"/>
-              </w:rPr>
-              <w:t>moveRight</w:t>
-            </w:r>
-            <w:proofErr w:type="spellEnd"/>
-            <w:r>
-              <w:rPr>
-                <w:rFonts w:ascii="Aptos Narrow" w:hAnsi="Aptos Narrow"/>
-                <w:color w:val="000000"/>
-                <w:sz w:val="22"/>
-                <w:szCs w:val="22"/>
-              </w:rPr>
-              <w:t>(</w:t>
-            </w:r>
-            <w:proofErr w:type="gramEnd"/>
-            <w:r>
-              <w:rPr>
-                <w:rFonts w:ascii="Aptos Narrow" w:hAnsi="Aptos Narrow"/>
-                <w:color w:val="000000"/>
-                <w:sz w:val="22"/>
-                <w:szCs w:val="22"/>
-              </w:rPr>
-              <w:t xml:space="preserve">), </w:t>
-            </w:r>
-            <w:proofErr w:type="spellStart"/>
-            <w:proofErr w:type="gramStart"/>
-            <w:r>
-              <w:rPr>
-                <w:rFonts w:ascii="Aptos Narrow" w:hAnsi="Aptos Narrow"/>
-                <w:color w:val="000000"/>
-                <w:sz w:val="22"/>
-                <w:szCs w:val="22"/>
-              </w:rPr>
-              <w:t>catchPower</w:t>
-            </w:r>
-            <w:proofErr w:type="spellEnd"/>
-            <w:r>
-              <w:rPr>
-                <w:rFonts w:ascii="Aptos Narrow" w:hAnsi="Aptos Narrow"/>
-                <w:color w:val="000000"/>
-                <w:sz w:val="22"/>
-                <w:szCs w:val="22"/>
-              </w:rPr>
-              <w:t>(</w:t>
-            </w:r>
-            <w:proofErr w:type="gramEnd"/>
-            <w:r>
-              <w:rPr>
-                <w:rFonts w:ascii="Aptos Narrow" w:hAnsi="Aptos Narrow"/>
-                <w:color w:val="000000"/>
-                <w:sz w:val="22"/>
-                <w:szCs w:val="22"/>
-              </w:rPr>
-              <w:t>)</w:t>
+              <w:t>moveLeft(), moveRight(), catchPower()</w:t>
             </w:r>
           </w:p>
         </w:tc>
@@ -1628,19 +1204,8 @@
                 <w:sz w:val="22"/>
                 <w:szCs w:val="22"/>
               </w:rPr>
-              <w:t xml:space="preserve">Ball, </w:t>
+              <w:t>Ball, PowerUp</w:t>
             </w:r>
-            <w:proofErr w:type="spellStart"/>
-            <w:r>
-              <w:rPr>
-                <w:rFonts w:ascii="Aptos Narrow" w:hAnsi="Aptos Narrow"/>
-                <w:color w:val="000000"/>
-                <w:sz w:val="22"/>
-                <w:szCs w:val="22"/>
-              </w:rPr>
-              <w:t>PowerUp</w:t>
-            </w:r>
-            <w:proofErr w:type="spellEnd"/>
           </w:p>
         </w:tc>
       </w:tr>
@@ -1739,7 +1304,6 @@
                 <w:szCs w:val="22"/>
               </w:rPr>
             </w:pPr>
-            <w:proofErr w:type="spellStart"/>
             <w:r>
               <w:rPr>
                 <w:rFonts w:ascii="Aptos Narrow" w:hAnsi="Aptos Narrow"/>
@@ -1747,49 +1311,8 @@
                 <w:sz w:val="22"/>
                 <w:szCs w:val="22"/>
               </w:rPr>
-              <w:t>health</w:t>
+              <w:t>health, type, containsPower</w:t>
             </w:r>
-            <w:proofErr w:type="spellEnd"/>
-            <w:r>
-              <w:rPr>
-                <w:rFonts w:ascii="Aptos Narrow" w:hAnsi="Aptos Narrow"/>
-                <w:color w:val="000000"/>
-                <w:sz w:val="22"/>
-                <w:szCs w:val="22"/>
-              </w:rPr>
-              <w:t xml:space="preserve">, </w:t>
-            </w:r>
-            <w:proofErr w:type="spellStart"/>
-            <w:r>
-              <w:rPr>
-                <w:rFonts w:ascii="Aptos Narrow" w:hAnsi="Aptos Narrow"/>
-                <w:color w:val="000000"/>
-                <w:sz w:val="22"/>
-                <w:szCs w:val="22"/>
-              </w:rPr>
-              <w:t>type</w:t>
-            </w:r>
-            <w:proofErr w:type="spellEnd"/>
-            <w:r>
-              <w:rPr>
-                <w:rFonts w:ascii="Aptos Narrow" w:hAnsi="Aptos Narrow"/>
-                <w:color w:val="000000"/>
-                <w:sz w:val="22"/>
-                <w:szCs w:val="22"/>
-              </w:rPr>
-              <w:t xml:space="preserve">, </w:t>
-            </w:r>
-            <w:proofErr w:type="spellStart"/>
-            <w:r>
-              <w:rPr>
-                <w:rFonts w:ascii="Aptos Narrow" w:hAnsi="Aptos Narrow"/>
-                <w:color w:val="000000"/>
-                <w:sz w:val="22"/>
-                <w:szCs w:val="22"/>
-              </w:rPr>
-              <w:t>containsPower</w:t>
-            </w:r>
-            <w:proofErr w:type="spellEnd"/>
           </w:p>
         </w:tc>
         <w:tc>
@@ -1815,7 +1338,6 @@
                 <w:szCs w:val="22"/>
               </w:rPr>
             </w:pPr>
-            <w:proofErr w:type="gramStart"/>
             <w:r>
               <w:rPr>
                 <w:rFonts w:ascii="Aptos Narrow" w:hAnsi="Aptos Narrow"/>
@@ -1823,79 +1345,7 @@
                 <w:sz w:val="22"/>
                 <w:szCs w:val="22"/>
               </w:rPr>
-              <w:t>hit(</w:t>
-            </w:r>
-            <w:proofErr w:type="gramEnd"/>
-            <w:r>
-              <w:rPr>
-                <w:rFonts w:ascii="Aptos Narrow" w:hAnsi="Aptos Narrow"/>
-                <w:color w:val="000000"/>
-                <w:sz w:val="22"/>
-                <w:szCs w:val="22"/>
-              </w:rPr>
-              <w:t xml:space="preserve">), </w:t>
-            </w:r>
-            <w:proofErr w:type="spellStart"/>
-            <w:proofErr w:type="gramStart"/>
-            <w:r>
-              <w:rPr>
-                <w:rFonts w:ascii="Aptos Narrow" w:hAnsi="Aptos Narrow"/>
-                <w:color w:val="000000"/>
-                <w:sz w:val="22"/>
-                <w:szCs w:val="22"/>
-              </w:rPr>
-              <w:t>destroy</w:t>
-            </w:r>
-            <w:proofErr w:type="spellEnd"/>
-            <w:r>
-              <w:rPr>
-                <w:rFonts w:ascii="Aptos Narrow" w:hAnsi="Aptos Narrow"/>
-                <w:color w:val="000000"/>
-                <w:sz w:val="22"/>
-                <w:szCs w:val="22"/>
-              </w:rPr>
-              <w:t>(</w:t>
-            </w:r>
-            <w:proofErr w:type="gramEnd"/>
-            <w:r>
-              <w:rPr>
-                <w:rFonts w:ascii="Aptos Narrow" w:hAnsi="Aptos Narrow"/>
-                <w:color w:val="000000"/>
-                <w:sz w:val="22"/>
-                <w:szCs w:val="22"/>
-              </w:rPr>
-              <w:t xml:space="preserve">), </w:t>
-            </w:r>
-            <w:proofErr w:type="spellStart"/>
-            <w:proofErr w:type="gramStart"/>
-            <w:r>
-              <w:rPr>
-                <w:rFonts w:ascii="Aptos Narrow" w:hAnsi="Aptos Narrow"/>
-                <w:color w:val="000000"/>
-                <w:sz w:val="22"/>
-                <w:szCs w:val="22"/>
-              </w:rPr>
-              <w:t>releasePower</w:t>
-            </w:r>
-            <w:proofErr w:type="spellEnd"/>
-            <w:r>
-              <w:rPr>
-                <w:rFonts w:ascii="Aptos Narrow" w:hAnsi="Aptos Narrow"/>
-                <w:color w:val="000000"/>
-                <w:sz w:val="22"/>
-                <w:szCs w:val="22"/>
-              </w:rPr>
-              <w:t>(</w:t>
-            </w:r>
-            <w:proofErr w:type="gramEnd"/>
-            <w:r>
-              <w:rPr>
-                <w:rFonts w:ascii="Aptos Narrow" w:hAnsi="Aptos Narrow"/>
-                <w:color w:val="000000"/>
-                <w:sz w:val="22"/>
-                <w:szCs w:val="22"/>
-              </w:rPr>
-              <w:t>)</w:t>
+              <w:t>hit(), destroy(), releasePower()</w:t>
             </w:r>
           </w:p>
         </w:tc>
@@ -2029,7 +1479,6 @@
                 <w:szCs w:val="22"/>
               </w:rPr>
             </w:pPr>
-            <w:proofErr w:type="spellStart"/>
             <w:r>
               <w:rPr>
                 <w:rFonts w:ascii="Aptos Narrow" w:hAnsi="Aptos Narrow"/>
@@ -2037,49 +1486,8 @@
                 <w:sz w:val="22"/>
                 <w:szCs w:val="22"/>
               </w:rPr>
-              <w:t>levelNumber</w:t>
+              <w:t>levelNumber, bricks, difficulty</w:t>
             </w:r>
-            <w:proofErr w:type="spellEnd"/>
-            <w:r>
-              <w:rPr>
-                <w:rFonts w:ascii="Aptos Narrow" w:hAnsi="Aptos Narrow"/>
-                <w:color w:val="000000"/>
-                <w:sz w:val="22"/>
-                <w:szCs w:val="22"/>
-              </w:rPr>
-              <w:t xml:space="preserve">, </w:t>
-            </w:r>
-            <w:proofErr w:type="spellStart"/>
-            <w:r>
-              <w:rPr>
-                <w:rFonts w:ascii="Aptos Narrow" w:hAnsi="Aptos Narrow"/>
-                <w:color w:val="000000"/>
-                <w:sz w:val="22"/>
-                <w:szCs w:val="22"/>
-              </w:rPr>
-              <w:t>bricks</w:t>
-            </w:r>
-            <w:proofErr w:type="spellEnd"/>
-            <w:r>
-              <w:rPr>
-                <w:rFonts w:ascii="Aptos Narrow" w:hAnsi="Aptos Narrow"/>
-                <w:color w:val="000000"/>
-                <w:sz w:val="22"/>
-                <w:szCs w:val="22"/>
-              </w:rPr>
-              <w:t xml:space="preserve">, </w:t>
-            </w:r>
-            <w:proofErr w:type="spellStart"/>
-            <w:r>
-              <w:rPr>
-                <w:rFonts w:ascii="Aptos Narrow" w:hAnsi="Aptos Narrow"/>
-                <w:color w:val="000000"/>
-                <w:sz w:val="22"/>
-                <w:szCs w:val="22"/>
-              </w:rPr>
-              <w:t>difficulty</w:t>
-            </w:r>
-            <w:proofErr w:type="spellEnd"/>
           </w:p>
         </w:tc>
         <w:tc>
@@ -2105,8 +1513,6 @@
                 <w:szCs w:val="22"/>
               </w:rPr>
             </w:pPr>
-            <w:proofErr w:type="spellStart"/>
-            <w:proofErr w:type="gramStart"/>
             <w:r>
               <w:rPr>
                 <w:rFonts w:ascii="Aptos Narrow" w:hAnsi="Aptos Narrow"/>
@@ -2114,89 +1520,7 @@
                 <w:sz w:val="22"/>
                 <w:szCs w:val="22"/>
               </w:rPr>
-              <w:t>loadLevel</w:t>
-            </w:r>
-            <w:proofErr w:type="spellEnd"/>
-            <w:r>
-              <w:rPr>
-                <w:rFonts w:ascii="Aptos Narrow" w:hAnsi="Aptos Narrow"/>
-                <w:color w:val="000000"/>
-                <w:sz w:val="22"/>
-                <w:szCs w:val="22"/>
-              </w:rPr>
-              <w:t>(</w:t>
-            </w:r>
-            <w:proofErr w:type="gramEnd"/>
-            <w:r>
-              <w:rPr>
-                <w:rFonts w:ascii="Aptos Narrow" w:hAnsi="Aptos Narrow"/>
-                <w:color w:val="000000"/>
-                <w:sz w:val="22"/>
-                <w:szCs w:val="22"/>
-              </w:rPr>
-              <w:t xml:space="preserve">), </w:t>
-            </w:r>
-            <w:proofErr w:type="spellStart"/>
-            <w:proofErr w:type="gramStart"/>
-            <w:r>
-              <w:rPr>
-                <w:rFonts w:ascii="Aptos Narrow" w:hAnsi="Aptos Narrow"/>
-                <w:color w:val="000000"/>
-                <w:sz w:val="22"/>
-                <w:szCs w:val="22"/>
-              </w:rPr>
-              <w:t>update</w:t>
-            </w:r>
-            <w:proofErr w:type="spellEnd"/>
-            <w:r>
-              <w:rPr>
-                <w:rFonts w:ascii="Aptos Narrow" w:hAnsi="Aptos Narrow"/>
-                <w:color w:val="000000"/>
-                <w:sz w:val="22"/>
-                <w:szCs w:val="22"/>
-              </w:rPr>
-              <w:t>(</w:t>
-            </w:r>
-            <w:proofErr w:type="gramEnd"/>
-            <w:r>
-              <w:rPr>
-                <w:rFonts w:ascii="Aptos Narrow" w:hAnsi="Aptos Narrow"/>
-                <w:color w:val="000000"/>
-                <w:sz w:val="22"/>
-                <w:szCs w:val="22"/>
-              </w:rPr>
-              <w:t xml:space="preserve">), </w:t>
-            </w:r>
-            <w:proofErr w:type="spellStart"/>
-            <w:proofErr w:type="gramStart"/>
-            <w:r>
-              <w:rPr>
-                <w:rFonts w:ascii="Aptos Narrow" w:hAnsi="Aptos Narrow"/>
-                <w:color w:val="000000"/>
-                <w:sz w:val="22"/>
-                <w:szCs w:val="22"/>
-              </w:rPr>
-              <w:t>isCompleted</w:t>
-            </w:r>
-            <w:proofErr w:type="spellEnd"/>
-            <w:r>
-              <w:rPr>
-                <w:rFonts w:ascii="Aptos Narrow" w:hAnsi="Aptos Narrow"/>
-                <w:color w:val="000000"/>
-                <w:sz w:val="22"/>
-                <w:szCs w:val="22"/>
-              </w:rPr>
-              <w:t>(</w:t>
-            </w:r>
-            <w:proofErr w:type="gramEnd"/>
-            <w:r>
-              <w:rPr>
-                <w:rFonts w:ascii="Aptos Narrow" w:hAnsi="Aptos Narrow"/>
-                <w:color w:val="000000"/>
-                <w:sz w:val="22"/>
-                <w:szCs w:val="22"/>
-              </w:rPr>
-              <w:t>)</w:t>
+              <w:t>loadLevel(), update(), isCompleted()</w:t>
             </w:r>
           </w:p>
         </w:tc>
@@ -2230,19 +1554,8 @@
                 <w:sz w:val="22"/>
                 <w:szCs w:val="22"/>
               </w:rPr>
-              <w:t xml:space="preserve">Brick, </w:t>
+              <w:t>Brick, Game</w:t>
             </w:r>
-            <w:proofErr w:type="spellStart"/>
-            <w:r>
-              <w:rPr>
-                <w:rFonts w:ascii="Aptos Narrow" w:hAnsi="Aptos Narrow"/>
-                <w:color w:val="000000"/>
-                <w:sz w:val="22"/>
-                <w:szCs w:val="22"/>
-              </w:rPr>
-              <w:t>Game</w:t>
-            </w:r>
-            <w:proofErr w:type="spellEnd"/>
           </w:p>
         </w:tc>
       </w:tr>
@@ -2348,39 +1661,8 @@
                 <w:sz w:val="22"/>
                 <w:szCs w:val="22"/>
               </w:rPr>
-              <w:t xml:space="preserve">score, </w:t>
+              <w:t>score, lives, currentLevel</w:t>
             </w:r>
-            <w:proofErr w:type="spellStart"/>
-            <w:r>
-              <w:rPr>
-                <w:rFonts w:ascii="Aptos Narrow" w:hAnsi="Aptos Narrow"/>
-                <w:color w:val="000000"/>
-                <w:sz w:val="22"/>
-                <w:szCs w:val="22"/>
-              </w:rPr>
-              <w:t>lives</w:t>
-            </w:r>
-            <w:proofErr w:type="spellEnd"/>
-            <w:r>
-              <w:rPr>
-                <w:rFonts w:ascii="Aptos Narrow" w:hAnsi="Aptos Narrow"/>
-                <w:color w:val="000000"/>
-                <w:sz w:val="22"/>
-                <w:szCs w:val="22"/>
-              </w:rPr>
-              <w:t xml:space="preserve">, </w:t>
-            </w:r>
-            <w:proofErr w:type="spellStart"/>
-            <w:r>
-              <w:rPr>
-                <w:rFonts w:ascii="Aptos Narrow" w:hAnsi="Aptos Narrow"/>
-                <w:color w:val="000000"/>
-                <w:sz w:val="22"/>
-                <w:szCs w:val="22"/>
-              </w:rPr>
-              <w:t>currentLevel</w:t>
-            </w:r>
-            <w:proofErr w:type="spellEnd"/>
           </w:p>
         </w:tc>
         <w:tc>
@@ -2406,8 +1688,6 @@
                 <w:szCs w:val="22"/>
               </w:rPr>
             </w:pPr>
-            <w:proofErr w:type="spellStart"/>
-            <w:proofErr w:type="gramStart"/>
             <w:r>
               <w:rPr>
                 <w:rFonts w:ascii="Aptos Narrow" w:hAnsi="Aptos Narrow"/>
@@ -2415,58 +1695,7 @@
                 <w:sz w:val="22"/>
                 <w:szCs w:val="22"/>
               </w:rPr>
-              <w:t>drawHUD</w:t>
-            </w:r>
-            <w:proofErr w:type="spellEnd"/>
-            <w:r>
-              <w:rPr>
-                <w:rFonts w:ascii="Aptos Narrow" w:hAnsi="Aptos Narrow"/>
-                <w:color w:val="000000"/>
-                <w:sz w:val="22"/>
-                <w:szCs w:val="22"/>
-              </w:rPr>
-              <w:t>(</w:t>
-            </w:r>
-            <w:proofErr w:type="gramEnd"/>
-            <w:r>
-              <w:rPr>
-                <w:rFonts w:ascii="Aptos Narrow" w:hAnsi="Aptos Narrow"/>
-                <w:color w:val="000000"/>
-                <w:sz w:val="22"/>
-                <w:szCs w:val="22"/>
-              </w:rPr>
-              <w:t xml:space="preserve">), </w:t>
-            </w:r>
-            <w:proofErr w:type="spellStart"/>
-            <w:proofErr w:type="gramStart"/>
-            <w:r>
-              <w:rPr>
-                <w:rFonts w:ascii="Aptos Narrow" w:hAnsi="Aptos Narrow"/>
-                <w:color w:val="000000"/>
-                <w:sz w:val="22"/>
-                <w:szCs w:val="22"/>
-              </w:rPr>
-              <w:t>updateScore</w:t>
-            </w:r>
-            <w:proofErr w:type="spellEnd"/>
-            <w:r>
-              <w:rPr>
-                <w:rFonts w:ascii="Aptos Narrow" w:hAnsi="Aptos Narrow"/>
-                <w:color w:val="000000"/>
-                <w:sz w:val="22"/>
-                <w:szCs w:val="22"/>
-              </w:rPr>
-              <w:t>(</w:t>
-            </w:r>
-            <w:proofErr w:type="gramEnd"/>
-            <w:r>
-              <w:rPr>
-                <w:rFonts w:ascii="Aptos Narrow" w:hAnsi="Aptos Narrow"/>
-                <w:color w:val="000000"/>
-                <w:sz w:val="22"/>
-                <w:szCs w:val="22"/>
-              </w:rPr>
-              <w:t>)</w:t>
+              <w:t>drawHUD(), updateScore()</w:t>
             </w:r>
           </w:p>
         </w:tc>
@@ -2493,7 +1722,6 @@
                 <w:szCs w:val="22"/>
               </w:rPr>
             </w:pPr>
-            <w:proofErr w:type="spellStart"/>
             <w:r>
               <w:rPr>
                 <w:rFonts w:ascii="Aptos Narrow" w:hAnsi="Aptos Narrow"/>
@@ -2503,7 +1731,6 @@
               </w:rPr>
               <w:t>Game</w:t>
             </w:r>
-            <w:proofErr w:type="spellEnd"/>
           </w:p>
         </w:tc>
       </w:tr>
@@ -2534,7 +1761,6 @@
                 <w:szCs w:val="22"/>
               </w:rPr>
             </w:pPr>
-            <w:proofErr w:type="spellStart"/>
             <w:r>
               <w:rPr>
                 <w:rFonts w:ascii="Aptos Narrow" w:hAnsi="Aptos Narrow"/>
@@ -2544,7 +1770,6 @@
               </w:rPr>
               <w:t>PowerUp</w:t>
             </w:r>
-            <w:proofErr w:type="spellEnd"/>
           </w:p>
         </w:tc>
         <w:tc>
@@ -2604,7 +1829,6 @@
                 <w:szCs w:val="22"/>
               </w:rPr>
             </w:pPr>
-            <w:proofErr w:type="spellStart"/>
             <w:r>
               <w:rPr>
                 <w:rFonts w:ascii="Aptos Narrow" w:hAnsi="Aptos Narrow"/>
@@ -2612,49 +1836,8 @@
                 <w:sz w:val="22"/>
                 <w:szCs w:val="22"/>
               </w:rPr>
-              <w:t>type</w:t>
+              <w:t>type, duration, isActive</w:t>
             </w:r>
-            <w:proofErr w:type="spellEnd"/>
-            <w:r>
-              <w:rPr>
-                <w:rFonts w:ascii="Aptos Narrow" w:hAnsi="Aptos Narrow"/>
-                <w:color w:val="000000"/>
-                <w:sz w:val="22"/>
-                <w:szCs w:val="22"/>
-              </w:rPr>
-              <w:t xml:space="preserve">, </w:t>
-            </w:r>
-            <w:proofErr w:type="spellStart"/>
-            <w:r>
-              <w:rPr>
-                <w:rFonts w:ascii="Aptos Narrow" w:hAnsi="Aptos Narrow"/>
-                <w:color w:val="000000"/>
-                <w:sz w:val="22"/>
-                <w:szCs w:val="22"/>
-              </w:rPr>
-              <w:t>duration</w:t>
-            </w:r>
-            <w:proofErr w:type="spellEnd"/>
-            <w:r>
-              <w:rPr>
-                <w:rFonts w:ascii="Aptos Narrow" w:hAnsi="Aptos Narrow"/>
-                <w:color w:val="000000"/>
-                <w:sz w:val="22"/>
-                <w:szCs w:val="22"/>
-              </w:rPr>
-              <w:t xml:space="preserve">, </w:t>
-            </w:r>
-            <w:proofErr w:type="spellStart"/>
-            <w:r>
-              <w:rPr>
-                <w:rFonts w:ascii="Aptos Narrow" w:hAnsi="Aptos Narrow"/>
-                <w:color w:val="000000"/>
-                <w:sz w:val="22"/>
-                <w:szCs w:val="22"/>
-              </w:rPr>
-              <w:t>isActive</w:t>
-            </w:r>
-            <w:proofErr w:type="spellEnd"/>
           </w:p>
         </w:tc>
         <w:tc>
@@ -2680,8 +1863,6 @@
                 <w:szCs w:val="22"/>
               </w:rPr>
             </w:pPr>
-            <w:proofErr w:type="spellStart"/>
-            <w:proofErr w:type="gramStart"/>
             <w:r>
               <w:rPr>
                 <w:rFonts w:ascii="Aptos Narrow" w:hAnsi="Aptos Narrow"/>
@@ -2689,89 +1870,7 @@
                 <w:sz w:val="22"/>
                 <w:szCs w:val="22"/>
               </w:rPr>
-              <w:t>apply</w:t>
-            </w:r>
-            <w:proofErr w:type="spellEnd"/>
-            <w:r>
-              <w:rPr>
-                <w:rFonts w:ascii="Aptos Narrow" w:hAnsi="Aptos Narrow"/>
-                <w:color w:val="000000"/>
-                <w:sz w:val="22"/>
-                <w:szCs w:val="22"/>
-              </w:rPr>
-              <w:t>(</w:t>
-            </w:r>
-            <w:proofErr w:type="gramEnd"/>
-            <w:r>
-              <w:rPr>
-                <w:rFonts w:ascii="Aptos Narrow" w:hAnsi="Aptos Narrow"/>
-                <w:color w:val="000000"/>
-                <w:sz w:val="22"/>
-                <w:szCs w:val="22"/>
-              </w:rPr>
-              <w:t xml:space="preserve">), </w:t>
-            </w:r>
-            <w:proofErr w:type="spellStart"/>
-            <w:proofErr w:type="gramStart"/>
-            <w:r>
-              <w:rPr>
-                <w:rFonts w:ascii="Aptos Narrow" w:hAnsi="Aptos Narrow"/>
-                <w:color w:val="000000"/>
-                <w:sz w:val="22"/>
-                <w:szCs w:val="22"/>
-              </w:rPr>
-              <w:t>remove</w:t>
-            </w:r>
-            <w:proofErr w:type="spellEnd"/>
-            <w:r>
-              <w:rPr>
-                <w:rFonts w:ascii="Aptos Narrow" w:hAnsi="Aptos Narrow"/>
-                <w:color w:val="000000"/>
-                <w:sz w:val="22"/>
-                <w:szCs w:val="22"/>
-              </w:rPr>
-              <w:t>(</w:t>
-            </w:r>
-            <w:proofErr w:type="gramEnd"/>
-            <w:r>
-              <w:rPr>
-                <w:rFonts w:ascii="Aptos Narrow" w:hAnsi="Aptos Narrow"/>
-                <w:color w:val="000000"/>
-                <w:sz w:val="22"/>
-                <w:szCs w:val="22"/>
-              </w:rPr>
-              <w:t xml:space="preserve">), </w:t>
-            </w:r>
-            <w:proofErr w:type="spellStart"/>
-            <w:proofErr w:type="gramStart"/>
-            <w:r>
-              <w:rPr>
-                <w:rFonts w:ascii="Aptos Narrow" w:hAnsi="Aptos Narrow"/>
-                <w:color w:val="000000"/>
-                <w:sz w:val="22"/>
-                <w:szCs w:val="22"/>
-              </w:rPr>
-              <w:t>update</w:t>
-            </w:r>
-            <w:proofErr w:type="spellEnd"/>
-            <w:r>
-              <w:rPr>
-                <w:rFonts w:ascii="Aptos Narrow" w:hAnsi="Aptos Narrow"/>
-                <w:color w:val="000000"/>
-                <w:sz w:val="22"/>
-                <w:szCs w:val="22"/>
-              </w:rPr>
-              <w:t>(</w:t>
-            </w:r>
-            <w:proofErr w:type="gramEnd"/>
-            <w:r>
-              <w:rPr>
-                <w:rFonts w:ascii="Aptos Narrow" w:hAnsi="Aptos Narrow"/>
-                <w:color w:val="000000"/>
-                <w:sz w:val="22"/>
-                <w:szCs w:val="22"/>
-              </w:rPr>
-              <w:t>)</w:t>
+              <w:t>apply(), remove(), update()</w:t>
             </w:r>
           </w:p>
         </w:tc>
@@ -2805,27 +1904,7 @@
                 <w:sz w:val="22"/>
                 <w:szCs w:val="22"/>
               </w:rPr>
-              <w:t xml:space="preserve">Ball, </w:t>
-            </w:r>
-            <w:proofErr w:type="gramStart"/>
-            <w:r>
-              <w:rPr>
-                <w:rFonts w:ascii="Aptos Narrow" w:hAnsi="Aptos Narrow"/>
-                <w:color w:val="000000"/>
-                <w:sz w:val="22"/>
-                <w:szCs w:val="22"/>
-              </w:rPr>
-              <w:t>Paddle</w:t>
-            </w:r>
-            <w:proofErr w:type="gramEnd"/>
-            <w:r>
-              <w:rPr>
-                <w:rFonts w:ascii="Aptos Narrow" w:hAnsi="Aptos Narrow"/>
-                <w:color w:val="000000"/>
-                <w:sz w:val="22"/>
-                <w:szCs w:val="22"/>
-              </w:rPr>
-              <w:t>, Brick</w:t>
+              <w:t>Ball, Paddle, Brick</w:t>
             </w:r>
           </w:p>
         </w:tc>
@@ -2847,15 +1926,7 @@
       </w:pPr>
       <w:r>
         <w:lastRenderedPageBreak/>
-        <w:t xml:space="preserve">Pseudocódigo del </w:t>
-      </w:r>
-      <w:proofErr w:type="spellStart"/>
-      <w:r>
-        <w:t>Game</w:t>
-      </w:r>
-      <w:proofErr w:type="spellEnd"/>
-      <w:r>
-        <w:t xml:space="preserve"> Loop principal.</w:t>
+        <w:t>Pseudocódigo del Game Loop principal.</w:t>
       </w:r>
     </w:p>
     <w:p>
@@ -2905,13 +1976,8 @@
         <w:spacing w:line="240" w:lineRule="auto"/>
       </w:pPr>
       <w:r>
-        <w:t xml:space="preserve">        - </w:t>
-      </w:r>
-      <w:proofErr w:type="spellStart"/>
-      <w:r>
-        <w:t>Sprites</w:t>
-      </w:r>
-      <w:proofErr w:type="spellEnd"/>
+        <w:t>        - Sprites</w:t>
+      </w:r>
     </w:p>
     <w:p>
       <w:pPr>
@@ -3642,35 +2708,7 @@
         <w:rPr>
           <w:lang w:val="en-US"/>
         </w:rPr>
-        <w:t xml:space="preserve">                </w:t>
-      </w:r>
-      <w:proofErr w:type="spellStart"/>
-      <w:r>
-        <w:rPr>
-          <w:lang w:val="en-US"/>
-        </w:rPr>
-        <w:t>Mostrar</w:t>
-      </w:r>
-      <w:proofErr w:type="spellEnd"/>
-      <w:r>
-        <w:rPr>
-          <w:lang w:val="en-US"/>
-        </w:rPr>
-        <w:t xml:space="preserve"> </w:t>
-      </w:r>
-      <w:proofErr w:type="spellStart"/>
-      <w:r>
-        <w:rPr>
-          <w:lang w:val="en-US"/>
-        </w:rPr>
-        <w:t>pantalla</w:t>
-      </w:r>
-      <w:proofErr w:type="spellEnd"/>
-      <w:r>
-        <w:rPr>
-          <w:lang w:val="en-US"/>
-        </w:rPr>
-        <w:t xml:space="preserve"> de Game Over</w:t>
+        <w:t>                Mostrar pantalla de Game Over</w:t>
       </w:r>
     </w:p>
     <w:p>
@@ -3841,141 +2879,127 @@
         <w:t xml:space="preserve">Hacer este ACA </w:t>
       </w:r>
       <w:r>
-        <w:t xml:space="preserve">real mente si </w:t>
-      </w:r>
-      <w:r>
-        <w:t>nos</w:t>
-      </w:r>
-      <w:r>
-        <w:t xml:space="preserve"> </w:t>
-      </w:r>
-      <w:proofErr w:type="spellStart"/>
-      <w:r>
-        <w:t>parecio</w:t>
-      </w:r>
-      <w:proofErr w:type="spellEnd"/>
-      <w:r>
-        <w:t xml:space="preserve"> muy fascinante ya que no lo tom</w:t>
+        <w:t>real mente si nos parecio muy fascinante ya que no lo tomamos como solo un entregable sino por el contrario como un producto que debe tener inicio y debe tener fin, claramente no se me está solicitando hacer un juego, ¡pero!, si buscamos buenas prácticas de creación, estructura y organización para la creación de un video juego, claro, falta mucho como bases de datos GDD entre muchas cosas, pero quería estructurar un proyecto que tenga una vista seria y responsable.</w:t>
+      </w:r>
+    </w:p>
+    <w:p/>
+    <w:p>
+      <w:pPr>
+        <w:spacing w:after="160"/>
+      </w:pPr>
+      <w:r>
+        <w:t xml:space="preserve">Ya en materia de aprendizaje </w:t>
+      </w:r>
+      <w:r>
+        <w:t>c</w:t>
+      </w:r>
+      <w:r>
+        <w:t>omprendimos</w:t>
+      </w:r>
+      <w:r>
+        <w:t xml:space="preserve"> que el diseño de un videojuego comienza mucho antes de escribir código. Al iniciar el trabajo </w:t>
+      </w:r>
+      <w:r>
+        <w:t>teniamos</w:t>
+      </w:r>
+      <w:r>
+        <w:t xml:space="preserve"> varias dudas sobre los entregables solicitados, especialmente porque confundía</w:t>
+      </w:r>
+      <w:r>
+        <w:t>mos</w:t>
+      </w:r>
+      <w:r>
+        <w:t xml:space="preserve"> el diagrama UML con el pseudocódigo. A medida que desarroll</w:t>
       </w:r>
       <w:r>
         <w:t>amos</w:t>
       </w:r>
       <w:r>
-        <w:t xml:space="preserve"> como solo un entregable sino por el contrario como un producto que debe tener inicio y debe tener fin, claramente no se me está solicitando hacer</w:t>
-      </w:r>
-      <w:r>
-        <w:t xml:space="preserve"> </w:t>
-      </w:r>
-      <w:r>
-        <w:t>un juego,</w:t>
-      </w:r>
-      <w:r>
-        <w:t xml:space="preserve"> ¡pero!,</w:t>
-      </w:r>
-      <w:r>
-        <w:t xml:space="preserve"> si bus</w:t>
-      </w:r>
-      <w:r>
-        <w:t>camos</w:t>
-      </w:r>
-      <w:r>
-        <w:t xml:space="preserve"> buenas prácticas de creación, estructura y organización para la creación de un video juego, claro, falta mucho como bases de datos GDD entre muchas cosas, pero quería estructurar un proyecto que tenga una vista seria y responsable.</w:t>
+        <w:t xml:space="preserve"> la actividad entendí</w:t>
+      </w:r>
+      <w:r>
+        <w:t>mos</w:t>
+      </w:r>
+      <w:r>
+        <w:t xml:space="preserve"> que el UML permite representar la estructura del videojuego mediante clases, atributos, métodos y relaciones, mientras que el pseudocódigo describe la lógica del funcionamiento del juego y del Game Loop sin depender de un lenguaje de programación.</w:t>
+      </w:r>
+    </w:p>
+    <w:p>
+      <w:pPr>
+        <w:spacing w:after="160"/>
+      </w:pPr>
+      <w:r>
+        <w:t xml:space="preserve">Otro aspecto nuevo para </w:t>
+      </w:r>
+      <w:r>
+        <w:t>nosotros</w:t>
+      </w:r>
+      <w:r>
+        <w:t xml:space="preserve"> fue la tabla de responsabilidades por clase. Antes de esta actividad no conocía</w:t>
+      </w:r>
+      <w:r>
+        <w:t>mos</w:t>
+      </w:r>
+      <w:r>
+        <w:t xml:space="preserve"> este tipo de documento ni su importancia dentro del diseño orientado a objetos. Al elaborarla comprendí</w:t>
+      </w:r>
+      <w:r>
+        <w:t>mos</w:t>
+      </w:r>
+      <w:r>
+        <w:t xml:space="preserve"> que ayuda a definir claramente la función de cada clase, facilitando la organización del proyecto</w:t>
+      </w:r>
+      <w:r>
+        <w:t xml:space="preserve"> y la creación del UML </w:t>
+      </w:r>
+      <w:r>
+        <w:t>y evitando mezclar responsabilidades entre las diferentes entidades del videojuego.</w:t>
       </w:r>
     </w:p>
     <w:p/>
     <w:p>
-      <w:pPr>
-        <w:spacing w:after="160"/>
-      </w:pPr>
-      <w:r>
-        <w:t xml:space="preserve">Ya en materia de aprendizaje </w:t>
-      </w:r>
-      <w:r>
-        <w:t>c</w:t>
-      </w:r>
-      <w:r>
-        <w:t>omprendimos</w:t>
-      </w:r>
-      <w:r>
-        <w:t xml:space="preserve"> que el diseño de un videojuego comienza mucho antes de escribir código. Al iniciar el trabajo </w:t>
-      </w:r>
-      <w:proofErr w:type="spellStart"/>
-      <w:r>
-        <w:t>teniamos</w:t>
-      </w:r>
-      <w:proofErr w:type="spellEnd"/>
-      <w:r>
-        <w:t xml:space="preserve"> varias dudas sobre los entregables solicitados, especialmente porque confundía</w:t>
-      </w:r>
-      <w:r>
-        <w:t>mos</w:t>
-      </w:r>
-      <w:r>
-        <w:t xml:space="preserve"> el diagrama UML con el pseudocódigo. A medida que desarroll</w:t>
-      </w:r>
-      <w:r>
-        <w:t>amos</w:t>
-      </w:r>
-      <w:r>
-        <w:t xml:space="preserve"> la actividad </w:t>
-      </w:r>
-      <w:proofErr w:type="spellStart"/>
-      <w:r>
-        <w:t>entendí</w:t>
-      </w:r>
-      <w:r>
-        <w:t>mos</w:t>
-      </w:r>
-      <w:proofErr w:type="spellEnd"/>
-      <w:r>
-        <w:t xml:space="preserve"> que el UML permite representar la estructura del videojuego mediante clases, atributos, métodos y relaciones, mientras que el pseudocódigo describe la lógica del funcionamiento del juego y del </w:t>
-      </w:r>
-      <w:proofErr w:type="spellStart"/>
-      <w:r>
-        <w:t>Game</w:t>
-      </w:r>
-      <w:proofErr w:type="spellEnd"/>
-      <w:r>
-        <w:t xml:space="preserve"> Loop sin depender de un lenguaje de programación.</w:t>
-      </w:r>
-    </w:p>
-    <w:p>
-      <w:pPr>
-        <w:spacing w:after="160"/>
-      </w:pPr>
-      <w:r>
-        <w:t xml:space="preserve">Otro aspecto nuevo para </w:t>
-      </w:r>
-      <w:r>
-        <w:t>nosotros</w:t>
-      </w:r>
-      <w:r>
-        <w:t xml:space="preserve"> fue la tabla de responsabilidades por clase. Antes de esta actividad no conocía</w:t>
-      </w:r>
-      <w:r>
-        <w:t>mos</w:t>
-      </w:r>
-      <w:r>
-        <w:t xml:space="preserve"> este tipo de documento ni su importancia dentro del diseño orientado a objetos. Al elaborarla </w:t>
-      </w:r>
-      <w:proofErr w:type="spellStart"/>
-      <w:r>
-        <w:t>comprendí</w:t>
-      </w:r>
-      <w:r>
-        <w:t>mos</w:t>
-      </w:r>
-      <w:proofErr w:type="spellEnd"/>
-      <w:r>
-        <w:t xml:space="preserve"> que ayuda a definir claramente la función de cada clase, facilitando la organización del proyecto</w:t>
-      </w:r>
-      <w:r>
-        <w:t xml:space="preserve"> y la creación del UML </w:t>
-      </w:r>
-      <w:r>
-        <w:t>y evitando mezclar responsabilidades entre las diferentes entidades del videojuego.</w:t>
-      </w:r>
-    </w:p>
+      <w:r>
+        <w:t xml:space="preserve">Otro aprendizaje importante fue volver a utilizar archivos con formato </w:t>
+      </w:r>
+      <w:r>
+        <w:rPr>
+          <w:b/>
+          <w:bCs/>
+        </w:rPr>
+        <w:t>Markdown (.md)</w:t>
+      </w:r>
+      <w:r>
+        <w:t xml:space="preserve"> para documentar el proyecto. Aunque ya conocíamos este formato, hacía bastante tiempo no lo utilizábamos y esta actividad permitió recordar nuevamente su sintaxis y las ventajas que ofrece para organizar documentación técnica dentro de un proyecto de software. Gracias al uso de Markdown fue posible estructurar el concepto del juego, las entidades y el pseudocódigo de una manera clara, ordenada y fácil de mantener, tal como se realiza en muchos proyectos reales de desarrollo de software.</w:t>
+      </w:r>
+    </w:p>
+    <w:p/>
+    <w:p>
+      <w:r>
+        <w:lastRenderedPageBreak/>
+        <w:t xml:space="preserve">Adicionalmente, esta actividad permitió tener un primer acercamiento a </w:t>
+      </w:r>
+      <w:r>
+        <w:rPr>
+          <w:b/>
+          <w:bCs/>
+        </w:rPr>
+        <w:t>Lua</w:t>
+      </w:r>
+      <w:r>
+        <w:t xml:space="preserve"> y al motor </w:t>
+      </w:r>
+      <w:r>
+        <w:rPr>
+          <w:b/>
+          <w:bCs/>
+        </w:rPr>
+        <w:t>Love2D</w:t>
+      </w:r>
+      <w:r>
+        <w:t>. Aunque todavía no desarrollamos el videojuego como tal, fue interesante comprender la estructura básica que debe tener un proyecto, conocer la función de archivos como main.lua y conf.lua, así como entender que Love2D utiliza funciones específicas como love.load(), love.update() y love.draw() para controlar el ciclo principal del juego. Este primer contacto con la sintaxis de Lua despertó aún más nuestro interés por continuar aprendiendo el lenguaje durante el desarrollo de la especialización.</w:t>
+      </w:r>
+    </w:p>
+    <w:p/>
     <w:p/>
     <w:p/>
     <w:sectPr>
@@ -7309,6 +6333,18 @@
       <w:shd w:val="clear" w:color="auto" w:fill="E1DFDD"/>
     </w:rPr>
   </w:style>
+  <w:style w:type="character" w:styleId="Hipervnculovisitado">
+    <w:name w:val="FollowedHyperlink"/>
+    <w:basedOn w:val="Fuentedeprrafopredeter"/>
+    <w:uiPriority w:val="99"/>
+    <w:semiHidden/>
+    <w:unhideWhenUsed/>
+    <w:rsid w:val="005B45DE"/>
+    <w:rPr>
+      <w:color w:val="954F72" w:themeColor="followedHyperlink"/>
+      <w:u w:val="single"/>
+    </w:rPr>
+  </w:style>
 </w:styles>
 </file>
 

</xml_diff>